<commit_message>
Revisado formato informe propuesta ANECA
Se ha ajustado el formato para cuadrarlo en 5 pags.
</commit_message>
<xml_diff>
--- a/docs/Propuesta_SCIE_ANECA_CNEAI.docx
+++ b/docs/Propuesta_SCIE_ANECA_CNEAI.docx
@@ -15,13 +15,13 @@
           <w:lang w:val="es-ES"/>
         </w:rPr>
         <w:drawing>
-          <wp:anchor distT="0" distB="0" distL="114300" distR="114300" simplePos="0" relativeHeight="251659264" behindDoc="1" locked="0" layoutInCell="1" allowOverlap="1" wp14:anchorId="3FB9B654" wp14:editId="004F64DD">
+          <wp:anchor distT="0" distB="0" distL="114300" distR="114300" simplePos="0" relativeHeight="251659264" behindDoc="1" locked="0" layoutInCell="1" allowOverlap="1" wp14:anchorId="3FB9B654" wp14:editId="3181287C">
             <wp:simplePos x="0" y="0"/>
             <wp:positionH relativeFrom="margin">
               <wp:posOffset>4438650</wp:posOffset>
             </wp:positionH>
             <wp:positionV relativeFrom="paragraph">
-              <wp:posOffset>-598805</wp:posOffset>
+              <wp:posOffset>-478155</wp:posOffset>
             </wp:positionV>
             <wp:extent cx="1231270" cy="479061"/>
             <wp:effectExtent l="0" t="0" r="6985" b="0"/>
@@ -213,7 +213,19 @@
         <w:rPr>
           <w:lang w:val="es-ES"/>
         </w:rPr>
-        <w:t>expone la particularidad de la Informática en cuanto a las publicaciones en congresos selectivos como canal principal para la evaluación, publicación y presentación de resultados originales de investigación. En el informe se analiza la situación actual y se presenta también los problemas e incoherencias del actual sistema de evaluación de las publicaciones de informática por parte de la ANECA y la CNEAI, y se presentan propuestas concretas.</w:t>
+        <w:t xml:space="preserve">expone la particularidad de la Informática en cuanto a las publicaciones en congresos selectivos como canal principal para la evaluación, publicación y presentación de resultados originales de investigación. En el informe se analiza la situación actual y se </w:t>
+      </w:r>
+      <w:r>
+        <w:rPr>
+          <w:lang w:val="es-ES"/>
+        </w:rPr>
+        <w:t>presentan</w:t>
+      </w:r>
+      <w:r>
+        <w:rPr>
+          <w:lang w:val="es-ES"/>
+        </w:rPr>
+        <w:t xml:space="preserve"> también los problemas e incoherencias del actual sistema de evaluación de las publicaciones de informática por parte de la ANECA y la CNEAI, y se presentan propuestas concretas.</w:t>
       </w:r>
     </w:p>
     <w:p>
@@ -234,7 +246,7 @@
         <w:rPr>
           <w:lang w:val="es-ES"/>
         </w:rPr>
-        <w:t xml:space="preserve">l informe bibliométrico [2], que analiza 170 congresos CORE/ICORE A* y A entre 2001 y 2025, muestra que España publica más artículos en términos absolutos que hace veinte años, pero pierde peso relativo dentro de Europa desde 2016: su cuota cae del 7,62 % en 2006-2010 al 4,23 % en 2021-2025, y su posición baja del 5.º al 8.º puesto europeo, con una caída todavía mayor en los congresos de máxima selectividad (A*), donde España pasa del 5.º al 9.º puesto. El propio informe bibliométrico [2] advierte de que mide presencia por afiliación, no impacto ni liderazgo, y no permite establecer una relación causal con el tratamiento normativo de los congresos. La SCIE no presenta ambos hechos como una relación de causa y efecto, sino como dos diagnósticos —uno disciplinar y otro bibliométrico— que apuntan en la misma dirección y que, juntos, dan urgencia a una corrección que, por motivos de coherencia con la práctica científica de la disciplina, sería necesaria por sí sola. </w:t>
+        <w:t xml:space="preserve">l informe bibliométrico [2], que analiza 170 congresos CORE/ICORE A* y A entre 2001 y 2025, muestra que España publica más artículos en términos absolutos que hace veinte años, pero pierde peso relativo dentro de Europa desde 2016: su cuota cae del 7,62 % en 2006-2010 al 4,23 % en 2021-2025, y su posición baja del 5.º al 8.º puesto europeo, con una caída todavía mayor en los congresos de máxima selectividad (A*), donde España pasa del 5.º al 9.º puesto. El propio informe [2] advierte de que mide presencia por afiliación, no impacto ni liderazgo, y no permite establecer una relación causal con el tratamiento normativo de los congresos. La SCIE no presenta ambos hechos como una relación de causa y efecto, sino como dos diagnósticos —uno disciplinar y otro bibliométrico— que apuntan en la misma dirección y que, juntos, dan urgencia a una corrección que, por motivos de coherencia con la práctica científica de la disciplina, sería necesaria por sí sola. </w:t>
       </w:r>
     </w:p>
     <w:p>
@@ -264,7 +276,19 @@
         <w:rPr>
           <w:lang w:val="es-ES"/>
         </w:rPr>
-        <w:t xml:space="preserve">La tesis de este documento es que, en el subcampo de Informática, los congresos clasificados como ICORE A* e ICORE A deben poder ser reconocidos como aportaciones ordinarias preferentes, equiparables funcionalmente a artículos en revistas de primer nivel, siempre que la persona solicitante justifique la relevancia e impacto de la contribución. </w:t>
+        <w:t xml:space="preserve">La tesis </w:t>
+      </w:r>
+      <w:r>
+        <w:rPr>
+          <w:lang w:val="es-ES"/>
+        </w:rPr>
+        <w:t xml:space="preserve">principal </w:t>
+      </w:r>
+      <w:r>
+        <w:rPr>
+          <w:lang w:val="es-ES"/>
+        </w:rPr>
+        <w:t xml:space="preserve">de este documento es que, en el subcampo de Informática, los congresos clasificados como ICORE A* e ICORE A deben poder ser reconocidos como aportaciones ordinarias preferentes, equiparables funcionalmente a artículos en revistas de primer nivel, siempre que la persona solicitante justifique la relevancia e impacto de la contribución. </w:t>
       </w:r>
     </w:p>
     <w:p>
@@ -308,7 +332,19 @@
         <w:rPr>
           <w:lang w:val="es-ES"/>
         </w:rPr>
-        <w:t>En áreas centrales de la Informática —inteligencia artificial, aprendizaje automático, sistemas, tecnologías de computadores, redes, seguridad, bases de datos, ingeniería del software—, el congreso selectivo cumple el mismo papel que en otras disciplinas cumple la revista de primer nivel: revisión exigente por pares, selección competitiva, publicación archivada y reconocimiento por parte de toda la comunidad. El dato es difícil de discutir: tres de los diez artículos más citados del siglo XXI en todas las ciencias son artículos de congreso de informática (</w:t>
+        <w:t xml:space="preserve">En áreas centrales de la Informática —inteligencia artificial, sistemas, </w:t>
+      </w:r>
+      <w:r>
+        <w:rPr>
+          <w:lang w:val="es-ES"/>
+        </w:rPr>
+        <w:t xml:space="preserve">arquitectura y </w:t>
+      </w:r>
+      <w:r>
+        <w:rPr>
+          <w:lang w:val="es-ES"/>
+        </w:rPr>
+        <w:t>tecnología de computadores, redes, seguridad, bases de datos, ingeniería del software—, el congreso selectivo cumple el mismo papel que en otras disciplinas cumple la revista de primer nivel: revisión exigente por pares, selección competitiva, publicación archivada y reconocimiento por parte de toda la comunidad. El dato es difícil de discutir: tres de los diez artículos más citados del siglo XXI en todas las ciencias son artículos de congreso de informática (</w:t>
       </w:r>
       <w:proofErr w:type="spellStart"/>
       <w:r>
@@ -362,7 +398,31 @@
         <w:rPr>
           <w:lang w:val="es-ES"/>
         </w:rPr>
-        <w:t>las mejores revistas del área.</w:t>
+        <w:t>las mejores revistas de</w:t>
+      </w:r>
+      <w:r>
+        <w:rPr>
+          <w:lang w:val="es-ES"/>
+        </w:rPr>
+        <w:t xml:space="preserve"> cada una de las </w:t>
+      </w:r>
+      <w:r>
+        <w:rPr>
+          <w:lang w:val="es-ES"/>
+        </w:rPr>
+        <w:t>área</w:t>
+      </w:r>
+      <w:r>
+        <w:rPr>
+          <w:lang w:val="es-ES"/>
+        </w:rPr>
+        <w:t>s</w:t>
+      </w:r>
+      <w:r>
+        <w:rPr>
+          <w:lang w:val="es-ES"/>
+        </w:rPr>
+        <w:t>.</w:t>
       </w:r>
     </w:p>
     <w:p>
@@ -378,7 +438,19 @@
           <w:lang w:val="es-ES"/>
         </w:rPr>
         <w:lastRenderedPageBreak/>
-        <w:t xml:space="preserve">Pese a esta evidencia, el sistema español sigue tratando las aportaciones a congresos como extraordinarias y subordinadas a la decisión discrecional de cada evaluador, dando marcha atrás respecto al reconocimiento explícito que sí existía en la Resolución CNEAI de 2020. Esta posición resulta además difícil de conciliar con los propios compromisos de ANECA: la agencia se adhirió a </w:t>
+        <w:t xml:space="preserve">Pese a esta evidencia, el sistema español sigue tratando las aportaciones a congresos como extraordinarias y subordinadas a la decisión discrecional de </w:t>
+      </w:r>
+      <w:r>
+        <w:rPr>
+          <w:lang w:val="es-ES"/>
+        </w:rPr>
+        <w:t>los evaluadores</w:t>
+      </w:r>
+      <w:r>
+        <w:rPr>
+          <w:lang w:val="es-ES"/>
+        </w:rPr>
+        <w:t xml:space="preserve">, dando marcha atrás respecto al reconocimiento explícito que sí existía en la Resolución CNEAI de 2020. Esta posición resulta además difícil de conciliar con los propios compromisos de ANECA: la agencia se adhirió a </w:t>
       </w:r>
       <w:proofErr w:type="spellStart"/>
       <w:r>
@@ -505,7 +577,19 @@
         <w:rPr>
           <w:lang w:val="es-ES"/>
         </w:rPr>
-        <w:t>El informe bibliométrico [2] se construye sobre un corpus fijo de 170 congresos CORE/ICORE 2026 clasificados como A* o A, con 535.144 artículos publicados entre 2001 y 2025 y una resolución de país del 84,56 % de los casos. España publica más que nunca en términos absolutos —pasa de 967 artículos en 2001-2005 a 1.990 en 2021-2025—, pero su peso dentro del bloque europeo de referencia (la Unión Europea más el Reino Unido) cae del máximo histórico del 7,62 % en 2006-2010 al 4,23 % en 2021-2025. La posición de España en el ranking europeo baja del 5.º al 8.º puesto, y la caída es todavía más marcada en los congresos de mayor exigencia (nivel A*), donde España pasa del 5.º al 9.º puesto. La comparación con otros países es reveladora: Reino Unido y Alemania son los únicos del bloque que aumentan su cuota de forma sostenida durante todo el periodo, mientras que España pierde terreno incluso frente a un país de tamaño y estructura comparables como Italia, cuya ventaja relativa sobre España casi se duplica entre 2006-2010 y 2021-2025.</w:t>
+        <w:t xml:space="preserve">El informe bibliométrico [2] se construye sobre un corpus fijo de 170 congresos CORE/ICORE 2026 clasificados como A* o A, con 535.144 artículos publicados entre 2001 y 2025 y una resolución de país del 84,56 % de los casos. España publica más que nunca en términos absolutos —pasa de 967 artículos en 2001-2005 a 1.990 en 2021-2025—, pero su peso dentro del bloque europeo de referencia (la Unión Europea más el Reino Unido) cae del máximo histórico del 7,62 % en 2006-2010 al 4,23 % en 2021-2025. La posición de España en el ranking europeo baja del 5.º al 8.º puesto, y la caída es </w:t>
+      </w:r>
+      <w:r>
+        <w:rPr>
+          <w:lang w:val="es-ES"/>
+        </w:rPr>
+        <w:t>aún</w:t>
+      </w:r>
+      <w:r>
+        <w:rPr>
+          <w:lang w:val="es-ES"/>
+        </w:rPr>
+        <w:t xml:space="preserve"> más marcada en los congresos de mayor exigencia (nivel A*), donde España pasa del 5.º al 9.º puesto. La comparación con otros países es reveladora: Reino Unido y Alemania son los únicos del bloque que aumentan su cuota de forma sostenida durante todo el periodo, mientras que España pierde terreno incluso frente a un país de tamaño y estructura comparables como Italia, cuya ventaja relativa sobre España casi se duplica entre 2006-2010 y 2021-2025.</w:t>
       </w:r>
     </w:p>
     <w:p>
@@ -639,6 +723,7 @@
     <w:p>
       <w:pPr>
         <w:pStyle w:val="Ttulo1"/>
+        <w:spacing w:before="240" w:after="120"/>
         <w:rPr>
           <w:lang w:val="es-ES"/>
         </w:rPr>
@@ -685,7 +770,19 @@
         <w:rPr>
           <w:lang w:val="es-ES"/>
         </w:rPr>
-        <w:t>La Informática debe evaluarse según sus prácticas reales de comunicación científica. En muchas subáreas, los congresos selectivos son publicaciones completas, revisadas por pares y reconocidas como canales terminales de publicación. A ello se suma una razón propia del ritmo de la disciplina: en áreas de evolución muy rápida, el ciclo de revisión de una revista puede tardar más que el tiempo que tarda un resultado en quedar superado por la propia comunidad, de modo que esperar a la publicación en revista no añade rigor, sino el riesgo de publicar un resultado ya obsoleto. Aplicar exclusivamente el patrón revista no mide calidad: mide conformidad con un formato ajeno a la disciplina.</w:t>
+        <w:t>La Informática debe evaluarse según sus prácticas reales de comunicación científica. En muchas subáreas</w:t>
+      </w:r>
+      <w:r>
+        <w:rPr>
+          <w:lang w:val="es-ES"/>
+        </w:rPr>
+        <w:t xml:space="preserve"> de la Informática</w:t>
+      </w:r>
+      <w:r>
+        <w:rPr>
+          <w:lang w:val="es-ES"/>
+        </w:rPr>
+        <w:t>, los congresos selectivos son publicaciones completas, revisadas por pares y reconocidas como canales terminales de publicación. A ello se suma una razón propia del ritmo de la disciplina: en áreas de evolución muy rápida, el ciclo de revisión de una revista puede tardar más que el tiempo que tarda un resultado en quedar superado por la propia comunidad, de modo que esperar a la publicación en revista no añade rigor, sino el riesgo de publicar un resultado ya obsoleto. Aplicar exclusivamente el patrón revista no mide calidad: mide conformidad con un formato ajeno a la disciplina.</w:t>
       </w:r>
     </w:p>
     <w:p>
@@ -783,6 +880,7 @@
     <w:p>
       <w:pPr>
         <w:pStyle w:val="Ttulo1"/>
+        <w:spacing w:before="240" w:after="120"/>
         <w:rPr>
           <w:lang w:val="es-ES"/>
         </w:rPr>
@@ -797,6 +895,7 @@
     <w:p>
       <w:pPr>
         <w:pStyle w:val="Ttulo2"/>
+        <w:spacing w:before="180" w:after="60"/>
         <w:rPr>
           <w:lang w:val="es-ES"/>
         </w:rPr>
@@ -825,9 +924,10 @@
     </w:p>
     <w:p>
       <w:pPr>
-        <w:spacing w:after="100"/>
-        <w:jc w:val="both"/>
-        <w:rPr>
+        <w:jc w:val="both"/>
+        <w:rPr>
+          <w:sz w:val="12"/>
+          <w:szCs w:val="12"/>
           <w:lang w:val="es-ES"/>
         </w:rPr>
       </w:pPr>
@@ -1427,22 +1527,28 @@
         <w:rPr>
           <w:lang w:val="es-ES"/>
         </w:rPr>
+        <w:t xml:space="preserve">Esta propuesta no abre la puerta a reconocer cualquier congreso sin criterio. Quedan excluidos de este reconocimiento, salvo justificación excepcional documentada, los </w:t>
+      </w:r>
+      <w:proofErr w:type="gramStart"/>
+      <w:r>
+        <w:rPr>
+          <w:lang w:val="es-ES"/>
+        </w:rPr>
+        <w:t>workshops satélite</w:t>
+      </w:r>
+      <w:proofErr w:type="gramEnd"/>
+      <w:r>
+        <w:rPr>
+          <w:lang w:val="es-ES"/>
+        </w:rPr>
+        <w:t xml:space="preserve">, posters, </w:t>
+      </w:r>
+      <w:r>
+        <w:rPr>
+          <w:lang w:val="es-ES"/>
+        </w:rPr>
         <w:lastRenderedPageBreak/>
-        <w:t xml:space="preserve">Esta propuesta no abre la puerta a reconocer cualquier congreso sin criterio. Quedan excluidos de este reconocimiento, salvo justificación excepcional documentada, los </w:t>
-      </w:r>
-      <w:proofErr w:type="gramStart"/>
-      <w:r>
-        <w:rPr>
-          <w:lang w:val="es-ES"/>
-        </w:rPr>
-        <w:t>workshops satélite</w:t>
-      </w:r>
-      <w:proofErr w:type="gramEnd"/>
-      <w:r>
-        <w:rPr>
-          <w:lang w:val="es-ES"/>
-        </w:rPr>
-        <w:t xml:space="preserve">, posters, demostraciones, resúmenes extendidos, </w:t>
+        <w:t xml:space="preserve">demostraciones, resúmenes extendidos, </w:t>
       </w:r>
       <w:proofErr w:type="spellStart"/>
       <w:r>
@@ -1564,6 +1670,7 @@
     <w:p>
       <w:pPr>
         <w:pStyle w:val="Ttulo2"/>
+        <w:spacing w:before="180" w:after="60"/>
         <w:rPr>
           <w:lang w:val="es-ES"/>
         </w:rPr>
@@ -1587,12 +1694,25 @@
         <w:rPr>
           <w:lang w:val="es-ES"/>
         </w:rPr>
-        <w:t>ANECA y CNEAI deben reconocer abiertamente que sus criterios condicionan al resto del sistema —comisiones de contratación, agencias autonómicas, escuelas de doctorado— y comunicar la reforma como lo que realmente es: una medida de alcance general para toda la carrera investigadora en informática, no un ajuste menor de una convocatoria concreta. En esta línea, ANECA debería emitir una nota de orientación dirigida a las agencias autonómicas de evaluación, universidades, centros e institutos de investigación, de forma que la heterogeneidad territorial no genere desigualdad entre investigadores según su comunidad de adscripción.</w:t>
+        <w:t xml:space="preserve">ANECA y CNEAI deben reconocer abiertamente que sus criterios condicionan al resto del sistema —comisiones de </w:t>
+      </w:r>
+      <w:r>
+        <w:rPr>
+          <w:lang w:val="es-ES"/>
+        </w:rPr>
+        <w:t xml:space="preserve">selección y </w:t>
+      </w:r>
+      <w:r>
+        <w:rPr>
+          <w:lang w:val="es-ES"/>
+        </w:rPr>
+        <w:t>contratación, agencias autonómicas, escuelas de doctorado— y comunicar la reforma como lo que realmente es: una medida de alcance general para toda la carrera investigadora en informática, no un ajuste menor de una convocatoria concreta. En esta línea, ANECA debería emitir una nota de orientación dirigida a las agencias autonómicas de evaluación, universidades, centros e institutos de investigación, de forma que la heterogeneidad territorial no genere desigualdad entre investigadores según su comunidad de adscripción.</w:t>
       </w:r>
     </w:p>
     <w:p>
       <w:pPr>
         <w:pStyle w:val="Ttulo2"/>
+        <w:spacing w:before="180" w:after="60"/>
         <w:rPr>
           <w:lang w:val="es-ES"/>
         </w:rPr>
@@ -1628,6 +1748,7 @@
     <w:p>
       <w:pPr>
         <w:pStyle w:val="Ttulo2"/>
+        <w:spacing w:before="180" w:after="60"/>
         <w:rPr>
           <w:lang w:val="es-ES"/>
         </w:rPr>
@@ -1679,12 +1800,37 @@
         <w:rPr>
           <w:lang w:val="es-ES"/>
         </w:rPr>
-        <w:t>, comités editoriales y roles de organización de los congresos ICORE A*/A, en pie de igualdad con otras responsabilidades de gestión y liderazgo científico ya reconocidas en otros campos de evaluación. Este reconocimiento no requiere financiación adicional ni la intervención de otros actores: basta con incorporarlo a la narrativa de impacto y a los criterios de valoración ya previstos en R3, de forma que dirigir, coordinar u organizar se reconozca con el mismo peso que publicar.</w:t>
+        <w:t>, comités editoriales y roles de organización de los congresos ICORE A*/A, en pie de igualdad con otras responsabilidades de gestión y liderazgo científico ya reconocidas en otros campos de evaluación. Este reconocimiento no requiere financiación adicional ni la intervención de otros actores: basta con incorporarlo a la narrativa de impacto y a los criterios de valoración ya previstos en</w:t>
+      </w:r>
+      <w:r>
+        <w:rPr>
+          <w:lang w:val="es-ES"/>
+        </w:rPr>
+        <w:t xml:space="preserve"> la recomendación</w:t>
+      </w:r>
+      <w:r>
+        <w:rPr>
+          <w:lang w:val="es-ES"/>
+        </w:rPr>
+        <w:t xml:space="preserve"> </w:t>
+      </w:r>
+      <w:r>
+        <w:rPr>
+          <w:lang w:val="es-ES"/>
+        </w:rPr>
+        <w:t xml:space="preserve">anterior, </w:t>
+      </w:r>
+      <w:r>
+        <w:rPr>
+          <w:lang w:val="es-ES"/>
+        </w:rPr>
+        <w:t>R3, de forma que dirigir, coordinar u organizar se reconozca con el mismo peso que publicar.</w:t>
       </w:r>
     </w:p>
     <w:p>
       <w:pPr>
         <w:pStyle w:val="Ttulo2"/>
+        <w:spacing w:before="180" w:after="60"/>
         <w:rPr>
           <w:lang w:val="es-ES"/>
         </w:rPr>
@@ -1708,62 +1854,89 @@
         <w:rPr>
           <w:lang w:val="es-ES"/>
         </w:rPr>
-        <w:t xml:space="preserve">Debe establecerse, con apoyo de la SCIE, un seguimiento bibliométrico periódico de la presencia y el liderazgo españoles en los congresos CORE/ICORE A*/A, replicando la metodología ya desarrollada en [2] y ampliándola para incorporar los indicadores de liderazgo descritos en el diagnóstico (1.4): autoría principal y sénior, coordinación de proyectos y artefactos, y participación en comités de programa y órganos de gobierno. Este seguimiento permitirá comprobar en los próximos años si la </w:t>
-      </w:r>
+        <w:t>Debe establecerse, con apoyo de la SCIE, un seguimiento bibliométrico periódico de la presencia y el liderazgo españoles en los congresos CORE/ICORE A*/A, replicando la metodología ya desarrollada en [2] y ampliándola para incorporar los indicadores de liderazgo descritos en el diagnóstico (</w:t>
+      </w:r>
+      <w:r>
+        <w:rPr>
+          <w:lang w:val="es-ES"/>
+        </w:rPr>
+        <w:t>§</w:t>
+      </w:r>
+      <w:r>
+        <w:rPr>
+          <w:lang w:val="es-ES"/>
+        </w:rPr>
+        <w:t>1.4): autoría principal y sénior, coordinación de proyectos y artefactos, y participación en comités de programa y órganos de gobierno. Este seguimiento permitirá comprobar en los próximos años si la reforma corrige la tendencia de presencia y, sobre todo, si consigue cerrar el vacío de liderazgo que hoy ni siquiera se mide. No requiere crear un nuevo organismo: basta con encargar su publicación periódica a la propia SCIE o a la AEI, reutilizando el pipeline reproducible ya disponible.</w:t>
+      </w:r>
+    </w:p>
+    <w:p>
+      <w:pPr>
+        <w:rPr>
+          <w:b/>
+          <w:bCs/>
+          <w:color w:val="1F3864"/>
+          <w:sz w:val="22"/>
+          <w:szCs w:val="24"/>
+          <w:lang w:val="es-ES"/>
+        </w:rPr>
+      </w:pPr>
+      <w:r>
+        <w:rPr>
+          <w:lang w:val="es-ES"/>
+        </w:rPr>
+        <w:br w:type="page"/>
+      </w:r>
+    </w:p>
+    <w:p>
+      <w:pPr>
+        <w:pStyle w:val="Ttulo2"/>
+        <w:spacing w:before="180" w:after="60"/>
+        <w:rPr>
+          <w:lang w:val="es-ES"/>
+        </w:rPr>
+      </w:pPr>
       <w:r>
         <w:rPr>
           <w:lang w:val="es-ES"/>
         </w:rPr>
         <w:lastRenderedPageBreak/>
-        <w:t>reforma corrige la tendencia de presencia y, sobre todo, si consigue cerrar el vacío de liderazgo que hoy ni siquiera se mide. No requiere crear un nuevo organismo: basta con encargar su publicación periódica a la propia SCIE o a la AEI, reutilizando el pipeline reproducible ya disponible.</w:t>
+        <w:t>R6. Coherencia dentro del propio Ministerio</w:t>
+      </w:r>
+    </w:p>
+    <w:p>
+      <w:pPr>
+        <w:spacing w:after="200"/>
+        <w:jc w:val="both"/>
+        <w:rPr>
+          <w:lang w:val="es-ES"/>
+        </w:rPr>
+      </w:pPr>
+      <w:r>
+        <w:rPr>
+          <w:lang w:val="es-ES"/>
+        </w:rPr>
+        <w:t>Resulta difícil de justificar que la Agencia Estatal de Investigación evalúe proyectos siguiendo los principios de DORA, sin discriminar por formato editorial, mientras CNEAI y ANECA evalúan trayectorias individuales con un criterio distinto. Es la misma administración aplicando dos varas de medir a la misma disciplina; corregir esa contradicción no exige ninguna concesión especial a la informática, exige simplemente coherencia interna.</w:t>
+      </w:r>
+    </w:p>
+    <w:p>
+      <w:pPr>
+        <w:pStyle w:val="Ttulo1"/>
+        <w:spacing w:before="180" w:after="120"/>
+        <w:rPr>
+          <w:lang w:val="es-ES"/>
+        </w:rPr>
+      </w:pPr>
+      <w:r>
+        <w:rPr>
+          <w:lang w:val="es-ES"/>
+        </w:rPr>
+        <w:t>4. Plan de actuación</w:t>
       </w:r>
     </w:p>
     <w:p>
       <w:pPr>
         <w:pStyle w:val="Ttulo2"/>
-        <w:rPr>
-          <w:lang w:val="es-ES"/>
-        </w:rPr>
-      </w:pPr>
-      <w:r>
-        <w:rPr>
-          <w:lang w:val="es-ES"/>
-        </w:rPr>
-        <w:t>R6. Coherencia dentro del propio Ministerio</w:t>
-      </w:r>
-    </w:p>
-    <w:p>
-      <w:pPr>
-        <w:spacing w:after="200"/>
-        <w:jc w:val="both"/>
-        <w:rPr>
-          <w:lang w:val="es-ES"/>
-        </w:rPr>
-      </w:pPr>
-      <w:r>
-        <w:rPr>
-          <w:lang w:val="es-ES"/>
-        </w:rPr>
-        <w:t>Resulta difícil de justificar que la Agencia Estatal de Investigación evalúe proyectos siguiendo los principios de DORA, sin discriminar por formato editorial, mientras CNEAI y ANECA evalúan trayectorias individuales con un criterio distinto. Es la misma administración aplicando dos varas de medir a la misma disciplina; corregir esa contradicción no exige ninguna concesión especial a la informática, exige simplemente coherencia interna.</w:t>
-      </w:r>
-    </w:p>
-    <w:p>
-      <w:pPr>
-        <w:pStyle w:val="Ttulo1"/>
-        <w:rPr>
-          <w:lang w:val="es-ES"/>
-        </w:rPr>
-      </w:pPr>
-      <w:r>
-        <w:rPr>
-          <w:lang w:val="es-ES"/>
-        </w:rPr>
-        <w:t>4. Plan de actuación</w:t>
-      </w:r>
-    </w:p>
-    <w:p>
-      <w:pPr>
-        <w:pStyle w:val="Ttulo2"/>
+        <w:spacing w:before="60" w:after="60"/>
         <w:rPr>
           <w:lang w:val="es-ES"/>
         </w:rPr>
@@ -1919,6 +2092,7 @@
     <w:p>
       <w:pPr>
         <w:pStyle w:val="Ttulo2"/>
+        <w:spacing w:before="60" w:after="60"/>
       </w:pPr>
       <w:r>
         <w:t xml:space="preserve">Fase 2 — Medio </w:t>
@@ -1956,7 +2130,19 @@
         <w:rPr>
           <w:lang w:val="es-ES"/>
         </w:rPr>
-        <w:t>Publicar el primer informe periódico de seguimiento bibliométrico previsto en la recomendación R5, ampliado con los indicadores de liderazgo del diagnóstico (1.4) y usando como línea de partida los datos 2021-2025 de [2].</w:t>
+        <w:t>Publicar el primer informe periódico de seguimiento bibliométrico previsto en la recomendación R5, ampliado con los indicadores de liderazgo del diagnóstico (</w:t>
+      </w:r>
+      <w:r>
+        <w:rPr>
+          <w:lang w:val="es-ES"/>
+        </w:rPr>
+        <w:t>§</w:t>
+      </w:r>
+      <w:r>
+        <w:rPr>
+          <w:lang w:val="es-ES"/>
+        </w:rPr>
+        <w:t>1.4) y usando como línea de partida los datos 2021-2025 de [2].</w:t>
       </w:r>
     </w:p>
     <w:p>
@@ -1990,12 +2176,25 @@
         <w:rPr>
           <w:lang w:val="es-ES"/>
         </w:rPr>
-        <w:t xml:space="preserve"> de la recomendación R6, y emitir la nota de orientación a agencias autonómicas prevista en R2.</w:t>
+        <w:t xml:space="preserve"> de la recomendación R6, y emitir la nota de orientación a agencias autonómicas prevista en </w:t>
+      </w:r>
+      <w:r>
+        <w:rPr>
+          <w:lang w:val="es-ES"/>
+        </w:rPr>
+        <w:t xml:space="preserve">la recomendación </w:t>
+      </w:r>
+      <w:r>
+        <w:rPr>
+          <w:lang w:val="es-ES"/>
+        </w:rPr>
+        <w:t>R2.</w:t>
       </w:r>
     </w:p>
     <w:p>
       <w:pPr>
         <w:pStyle w:val="Ttulo2"/>
+        <w:spacing w:before="60" w:after="60"/>
       </w:pPr>
       <w:r>
         <w:t xml:space="preserve">Fase 3 — Largo </w:t>
@@ -2033,7 +2232,7 @@
         <w:rPr>
           <w:lang w:val="es-ES"/>
         </w:rPr>
-        <w:t>Comprobar, con los datos del seguimiento periódico, si la reforma ha conseguido recuperar la cuota relativa española, prestando especial atención al nivel A* y a las áreas con mayor caída, inteligencia artificial y teoría.</w:t>
+        <w:t>Comprobar, con los datos del seguimiento periódico, si la reforma ha conseguido recuperar la cuota relativa española, prestando especial atención al nivel A* y a las áreas con mayor caída.</w:t>
       </w:r>
     </w:p>
     <w:p>
@@ -2052,7 +2251,19 @@
         <w:rPr>
           <w:lang w:val="es-ES"/>
         </w:rPr>
-        <w:t>Impulsar, junto a las agencias autonómicas de calidad universitaria, las escuelas de doctorado, las universidades y los centros e institutos de investigación, la extensión coherente del criterio a toda la carrera investigadora, dado el efecto de arrastre descrito en el diagnóstico.</w:t>
+        <w:t>Impulsar, junto a las agencias autonómicas de calidad universitaria, las escuelas de doctorado, las universidades</w:t>
+      </w:r>
+      <w:r>
+        <w:rPr>
+          <w:lang w:val="es-ES"/>
+        </w:rPr>
+        <w:t>, los departamentos</w:t>
+      </w:r>
+      <w:r>
+        <w:rPr>
+          <w:lang w:val="es-ES"/>
+        </w:rPr>
+        <w:t xml:space="preserve"> y los centros e institutos de investigación, la extensión coherente del criterio a toda la carrera investigadora, dado el efecto de arrastre descrito en el diagnóstico.</w:t>
       </w:r>
     </w:p>
     <w:p>
@@ -2102,6 +2313,7 @@
     <w:p>
       <w:pPr>
         <w:pStyle w:val="Ttulo1"/>
+        <w:spacing w:before="180" w:after="120"/>
         <w:rPr>
           <w:lang w:val="es-ES"/>
         </w:rPr>
@@ -2125,7 +2337,7 @@
         <w:rPr>
           <w:lang w:val="es-ES"/>
         </w:rPr>
-        <w:t xml:space="preserve">La SCIE no plantea esta propuesta como un privilegio para la informática, sino como la corrección de un error de diseño que lleva años produciendo un resultado previsible: investigadores que eligen el canal de publicación administrativamente rentable en lugar del canal científicamente correcto. Esa corrección es coherente con la práctica real de la disciplina, sobre todo en entornos internacionales, con los compromisos que la propia ANECA asumió al adherirse a </w:t>
+        <w:t xml:space="preserve">La SCIE no plantea esta propuesta como un privilegio para la informática, sino como la corrección de un error de diseño que lleva años produciendo un resultado previsible: investigadores que eligen el canal de publicación administrativamente rentable en lugar del científicamente correcto. Esa corrección es coherente con la práctica real de la disciplina, sobre todo en entornos internacionales, con los compromisos que la propia ANECA asumió al adherirse a </w:t>
       </w:r>
       <w:proofErr w:type="spellStart"/>
       <w:r>
@@ -2141,14 +2353,12 @@
         </w:rPr>
         <w:t xml:space="preserve">, y con un precedente normativo que ya existió en España hasta 2022. El diagnóstico bibliométrico aporta urgencia adicional: España pierde peso relativo precisamente frente a competidores europeos que sí valoran los congresos de informática como canales de publicación rigurosos de los resultados de investigación. La reforma evaluativa es el primer paso y el de mayor impacto inmediato sobre los incentivos del sistema; acompañada de las medidas de financiación y formación que </w:t>
       </w:r>
-      <w:proofErr w:type="gramStart"/>
-      <w:r>
-        <w:rPr>
-          <w:lang w:val="es-ES"/>
-        </w:rPr>
-        <w:t>le</w:t>
-      </w:r>
-      <w:proofErr w:type="gramEnd"/>
+      <w:r>
+        <w:rPr>
+          <w:lang w:val="es-ES"/>
+        </w:rPr>
+        <w:t>les</w:t>
+      </w:r>
       <w:r>
         <w:rPr>
           <w:lang w:val="es-ES"/>
@@ -2159,32 +2369,16 @@
     <w:p>
       <w:pPr>
         <w:pStyle w:val="Ttulo1"/>
-        <w:spacing w:before="240"/>
-        <w:rPr>
-          <w:lang w:val="es-ES"/>
-        </w:rPr>
-      </w:pPr>
-      <w:r>
-        <w:rPr>
-          <w:lang w:val="es-ES"/>
-        </w:rPr>
-        <w:lastRenderedPageBreak/>
+        <w:spacing w:before="180" w:after="120"/>
+        <w:rPr>
+          <w:lang w:val="es-ES"/>
+        </w:rPr>
+      </w:pPr>
+      <w:r>
+        <w:rPr>
+          <w:lang w:val="es-ES"/>
+        </w:rPr>
         <w:t>Referencias</w:t>
-      </w:r>
-    </w:p>
-    <w:p>
-      <w:pPr>
-        <w:spacing w:after="120"/>
-        <w:jc w:val="both"/>
-        <w:rPr>
-          <w:lang w:val="es-ES"/>
-        </w:rPr>
-      </w:pPr>
-      <w:r>
-        <w:rPr>
-          <w:lang w:val="es-ES"/>
-        </w:rPr>
-        <w:t>Este documento se apoya en dos informes técnicos independientes, elaborados en el contexto de la comunidad científica española de Informática, que se citan a lo largo del texto y que pueden adjuntarse como anexos según el formato final de presentación.</w:t>
       </w:r>
     </w:p>
     <w:p>
@@ -2192,23 +2386,31 @@
         <w:spacing w:after="80"/>
         <w:ind w:left="426" w:hanging="426"/>
         <w:rPr>
-          <w:lang w:val="es-ES"/>
-        </w:rPr>
-      </w:pPr>
-      <w:r>
-        <w:rPr>
+          <w:sz w:val="18"/>
+          <w:szCs w:val="18"/>
+          <w:lang w:val="es-ES"/>
+        </w:rPr>
+      </w:pPr>
+      <w:r>
+        <w:rPr>
+          <w:sz w:val="18"/>
+          <w:szCs w:val="18"/>
           <w:lang w:val="es-ES"/>
         </w:rPr>
         <w:t xml:space="preserve">[1] </w:t>
       </w:r>
       <w:r>
         <w:rPr>
+          <w:sz w:val="18"/>
+          <w:szCs w:val="18"/>
           <w:lang w:val="es-ES"/>
         </w:rPr>
         <w:tab/>
       </w:r>
       <w:r>
         <w:rPr>
+          <w:sz w:val="18"/>
+          <w:szCs w:val="18"/>
           <w:lang w:val="es-ES"/>
         </w:rPr>
         <w:t xml:space="preserve">SCIE. </w:t>
@@ -2217,6 +2419,8 @@
         <w:rPr>
           <w:i/>
           <w:iCs/>
+          <w:sz w:val="18"/>
+          <w:szCs w:val="18"/>
           <w:lang w:val="es-ES"/>
         </w:rPr>
         <w:t>“Congresos y revistas en informática: hacia una evaluación científica adecuada a la disciplina”</w:t>
@@ -2225,36 +2429,64 @@
         <w:rPr>
           <w:i/>
           <w:iCs/>
+          <w:sz w:val="18"/>
+          <w:szCs w:val="18"/>
           <w:lang w:val="es-ES"/>
         </w:rPr>
         <w:t xml:space="preserve"> </w:t>
       </w:r>
       <w:r>
         <w:rPr>
-          <w:lang w:val="es-ES"/>
-        </w:rPr>
-        <w:t xml:space="preserve">(informe fundacional). </w:t>
-      </w:r>
-      <w:r>
-        <w:rPr>
+          <w:sz w:val="18"/>
+          <w:szCs w:val="18"/>
+          <w:lang w:val="es-ES"/>
+        </w:rPr>
+        <w:t xml:space="preserve">(informe </w:t>
+      </w:r>
+      <w:r>
+        <w:rPr>
+          <w:sz w:val="18"/>
+          <w:szCs w:val="18"/>
+          <w:lang w:val="es-ES"/>
+        </w:rPr>
+        <w:t>de fundamentación</w:t>
+      </w:r>
+      <w:r>
+        <w:rPr>
+          <w:sz w:val="18"/>
+          <w:szCs w:val="18"/>
+          <w:lang w:val="es-ES"/>
+        </w:rPr>
+        <w:t xml:space="preserve">). </w:t>
+      </w:r>
+      <w:r>
+        <w:rPr>
+          <w:sz w:val="18"/>
+          <w:szCs w:val="18"/>
           <w:lang w:val="es-ES"/>
         </w:rPr>
         <w:t>30/06/2026</w:t>
       </w:r>
       <w:r>
         <w:rPr>
+          <w:sz w:val="18"/>
+          <w:szCs w:val="18"/>
           <w:lang w:val="es-ES"/>
         </w:rPr>
         <w:t>.</w:t>
       </w:r>
       <w:r>
         <w:rPr>
+          <w:sz w:val="18"/>
+          <w:szCs w:val="18"/>
           <w:lang w:val="es-ES"/>
         </w:rPr>
         <w:t xml:space="preserve"> </w:t>
       </w:r>
       <w:r>
         <w:rPr>
+          <w:sz w:val="18"/>
+          <w:szCs w:val="18"/>
           <w:lang w:val="es-ES"/>
         </w:rPr>
         <w:br/>
@@ -2263,6 +2495,8 @@
         <w:r>
           <w:rPr>
             <w:rStyle w:val="Hipervnculo"/>
+            <w:sz w:val="18"/>
+            <w:szCs w:val="18"/>
             <w:lang w:val="es-ES"/>
           </w:rPr>
           <w:t>https://github.com/AVallecillo/InformeBibliometrico2026/blob/main/docs/congresos_informatica_ANECA.pdf</w:t>
@@ -2270,6 +2504,8 @@
       </w:hyperlink>
       <w:r>
         <w:rPr>
+          <w:sz w:val="18"/>
+          <w:szCs w:val="18"/>
           <w:lang w:val="es-ES"/>
         </w:rPr>
         <w:t xml:space="preserve"> </w:t>
@@ -2279,23 +2515,31 @@
       <w:pPr>
         <w:ind w:left="426" w:hanging="426"/>
         <w:rPr>
-          <w:lang w:val="es-ES"/>
-        </w:rPr>
-      </w:pPr>
-      <w:r>
-        <w:rPr>
+          <w:sz w:val="18"/>
+          <w:szCs w:val="18"/>
+          <w:lang w:val="es-ES"/>
+        </w:rPr>
+      </w:pPr>
+      <w:r>
+        <w:rPr>
+          <w:sz w:val="18"/>
+          <w:szCs w:val="18"/>
           <w:lang w:val="es-ES"/>
         </w:rPr>
         <w:t>[2]</w:t>
       </w:r>
       <w:r>
         <w:rPr>
+          <w:sz w:val="18"/>
+          <w:szCs w:val="18"/>
           <w:lang w:val="es-ES"/>
         </w:rPr>
         <w:tab/>
       </w:r>
       <w:r>
         <w:rPr>
+          <w:sz w:val="18"/>
+          <w:szCs w:val="18"/>
           <w:lang w:val="es-ES"/>
         </w:rPr>
         <w:t>SCIE.</w:t>
@@ -2304,6 +2548,8 @@
         <w:rPr>
           <w:b/>
           <w:bCs/>
+          <w:sz w:val="18"/>
+          <w:szCs w:val="18"/>
           <w:lang w:val="es-ES"/>
         </w:rPr>
         <w:t xml:space="preserve"> </w:t>
@@ -2312,6 +2558,8 @@
         <w:rPr>
           <w:i/>
           <w:iCs/>
+          <w:sz w:val="18"/>
+          <w:szCs w:val="18"/>
           <w:lang w:val="es-ES"/>
         </w:rPr>
         <w:t xml:space="preserve">“Presencia española en congresos </w:t>
@@ -2320,6 +2568,8 @@
         <w:rPr>
           <w:i/>
           <w:iCs/>
+          <w:sz w:val="18"/>
+          <w:szCs w:val="18"/>
           <w:lang w:val="es-ES"/>
         </w:rPr>
         <w:t xml:space="preserve">internacionales de Informática. </w:t>
@@ -2328,6 +2578,8 @@
         <w:rPr>
           <w:i/>
           <w:iCs/>
+          <w:sz w:val="18"/>
+          <w:szCs w:val="18"/>
           <w:lang w:val="es-ES"/>
         </w:rPr>
         <w:t>Análisis bibliométrico sobre el corpus CORE/ICORE 2026 A* y A</w:t>
@@ -2336,24 +2588,32 @@
         <w:rPr>
           <w:i/>
           <w:iCs/>
+          <w:sz w:val="18"/>
+          <w:szCs w:val="18"/>
           <w:lang w:val="es-ES"/>
         </w:rPr>
         <w:t>”</w:t>
       </w:r>
       <w:r>
         <w:rPr>
+          <w:sz w:val="18"/>
+          <w:szCs w:val="18"/>
           <w:lang w:val="es-ES"/>
         </w:rPr>
         <w:t xml:space="preserve"> (informe bibliométrico). </w:t>
       </w:r>
       <w:r>
         <w:rPr>
+          <w:sz w:val="18"/>
+          <w:szCs w:val="18"/>
           <w:lang w:val="es-ES"/>
         </w:rPr>
         <w:t>25/06/</w:t>
       </w:r>
       <w:r>
         <w:rPr>
+          <w:sz w:val="18"/>
+          <w:szCs w:val="18"/>
           <w:lang w:val="es-ES"/>
         </w:rPr>
         <w:t xml:space="preserve">2026. </w:t>
@@ -2362,6 +2622,8 @@
         <w:r>
           <w:rPr>
             <w:rStyle w:val="Hipervnculo"/>
+            <w:sz w:val="18"/>
+            <w:szCs w:val="18"/>
             <w:lang w:val="es-ES"/>
           </w:rPr>
           <w:t>https://github.com/AVallecillo/InformeBibliometrico2026/blob/main/informe_presencia_espana_congresos_informatica_2026.pdf</w:t>
@@ -2369,6 +2631,8 @@
       </w:hyperlink>
       <w:r>
         <w:rPr>
+          <w:sz w:val="18"/>
+          <w:szCs w:val="18"/>
           <w:lang w:val="es-ES"/>
         </w:rPr>
         <w:t xml:space="preserve"> </w:t>
@@ -2377,7 +2641,7 @@
     <w:sectPr>
       <w:footerReference w:type="default" r:id="rId10"/>
       <w:pgSz w:w="11906" w:h="16838"/>
-      <w:pgMar w:top="1276" w:right="1440" w:bottom="1276" w:left="1440" w:header="708" w:footer="708" w:gutter="0"/>
+      <w:pgMar w:top="1276" w:right="1440" w:bottom="1134" w:left="1440" w:header="708" w:footer="708" w:gutter="0"/>
       <w:cols w:space="720"/>
       <w:docGrid w:linePitch="360"/>
     </w:sectPr>

</xml_diff>